<commit_message>
Bytter matplotlib med plotly for mer dynamsike figurer.
</commit_message>
<xml_diff>
--- a/docs/Evaluering.docx
+++ b/docs/Evaluering.docx
@@ -7,7 +7,10 @@
         <w:pStyle w:val="Tittel"/>
       </w:pPr>
       <w:r>
-        <w:t>Evaluering av Miljødataanalyse prosjekt</w:t>
+        <w:t>Refleksjon</w:t>
+      </w:r>
+      <w:r>
+        <w:t xml:space="preserve"> av Miljødataanalyse prosjekt</w:t>
       </w:r>
     </w:p>
     <w:p/>
@@ -31,8 +34,11 @@
       <w:proofErr w:type="spellEnd"/>
     </w:p>
     <w:p/>
-    <w:p/>
-    <w:p/>
+    <w:p>
+      <w:r>
+        <w:t xml:space="preserve">Vi i gruppe 44 startet tidlig med etablering av prosjektmappe i GitHub, samt opprettelse av egne miljø. </w:t>
+      </w:r>
+    </w:p>
     <w:sectPr>
       <w:pgSz w:w="11906" w:h="16838"/>
       <w:pgMar w:top="1417" w:right="1417" w:bottom="1417" w:left="1417" w:header="708" w:footer="708" w:gutter="0"/>

</xml_diff>